<commit_message>
Analise estatistica completa por grafico, com quebra ano a ano
Cada grafico passa a levar um bloco Analise: dispersao, concentracao,
valores atipicos por Tukey, evolucao, tendencia por regressao linear,
crescimento medio geometrico, indice sazonal e totais ano a ano com
variacao interanual.

Regra unica: nenhuma palavra qualitativa entra sem uma regra calculada, e
a regra vai escrita ao lado. Fica de fora avaliar desempenho -- isso
exigiria uma meta que o Excel nao tem.

Nenhum metodo corre sem pontos que cheguem; quando falta, o relatorio diz
que nao correu e porque. Metodos temporais nunca correm num eixo
categorico.

Tambem corrigido: gravar por cima de um .docx aberto no Word dava
traceback em vez de mensagem, e eixos com muitos periodos ficavam com os
rotulos sobrepostos.

Co-Authored-By: Claude Opus 5 (1M context) <noreply@anthropic.com>
</commit_message>
<xml_diff>
--- a/exemplos/relatorio_exemplo.docx
+++ b/exemplos/relatorio_exemplo.docx
@@ -7,7 +7,7 @@
         <w:pStyle w:val="Title"/>
       </w:pPr>
       <w:r>
-        <w:t>Vendas 2025</w:t>
+        <w:t>Vendas 2023–2025</w:t>
       </w:r>
     </w:p>
     <w:p>
@@ -59,306 +59,146 @@
     </w:p>
     <w:p>
       <w:r>
-        <w:t>O gráfico mostra o total de «Valor» por «Mes», a partir de 36 linhas agrupadas em 12 categorias. O total é 637.020. O valor mais alto é 90.000, em «Dezembro», e o mais baixo é 31.700, em «Fevereiro».</w:t>
+        <w:t>O gráfico mostra o total de «Valor» por «Periodo», a partir de 108 linhas agrupadas em 36 categorias. O total é 2.058.682. O valor mais alto é 112.420, em «2025-12», e o mais baixo é 29.160, em «2023-02».</w:t>
       </w:r>
     </w:p>
-    <w:tbl>
-      <w:tblPr>
-        <w:tblStyle w:val="LightGrid-Accent1"/>
-        <w:tblW w:type="auto" w:w="0"/>
-        <w:tblLook w:firstColumn="1" w:firstRow="1" w:lastColumn="0" w:lastRow="0" w:noHBand="0" w:noVBand="1" w:val="04A0"/>
-      </w:tblPr>
-      <w:tblGrid>
-        <w:gridCol w:w="4320"/>
-        <w:gridCol w:w="4320"/>
-      </w:tblGrid>
-      <w:tr>
-        <w:tc>
-          <w:tcPr>
-            <w:tcW w:type="dxa" w:w="4320"/>
-          </w:tcPr>
-          <w:p>
-            <w:r>
-              <w:t>Mes</w:t>
-            </w:r>
-          </w:p>
-        </w:tc>
-        <w:tc>
-          <w:tcPr>
-            <w:tcW w:type="dxa" w:w="4320"/>
-          </w:tcPr>
-          <w:p>
-            <w:r>
-              <w:t>Valor</w:t>
-            </w:r>
-          </w:p>
-        </w:tc>
-      </w:tr>
-      <w:tr>
-        <w:tc>
-          <w:tcPr>
-            <w:tcW w:type="dxa" w:w="4320"/>
-          </w:tcPr>
-          <w:p>
-            <w:r>
-              <w:t>Janeiro</w:t>
-            </w:r>
-          </w:p>
-        </w:tc>
-        <w:tc>
-          <w:tcPr>
-            <w:tcW w:type="dxa" w:w="4320"/>
-          </w:tcPr>
-          <w:p>
-            <w:r>
-              <w:t>33.820</w:t>
-            </w:r>
-          </w:p>
-        </w:tc>
-      </w:tr>
-      <w:tr>
-        <w:tc>
-          <w:tcPr>
-            <w:tcW w:type="dxa" w:w="4320"/>
-          </w:tcPr>
-          <w:p>
-            <w:r>
-              <w:t>Fevereiro</w:t>
-            </w:r>
-          </w:p>
-        </w:tc>
-        <w:tc>
-          <w:tcPr>
-            <w:tcW w:type="dxa" w:w="4320"/>
-          </w:tcPr>
-          <w:p>
-            <w:r>
-              <w:t>31.700</w:t>
-            </w:r>
-          </w:p>
-        </w:tc>
-      </w:tr>
-      <w:tr>
-        <w:tc>
-          <w:tcPr>
-            <w:tcW w:type="dxa" w:w="4320"/>
-          </w:tcPr>
-          <w:p>
-            <w:r>
-              <w:t>Marco</w:t>
-            </w:r>
-          </w:p>
-        </w:tc>
-        <w:tc>
-          <w:tcPr>
-            <w:tcW w:type="dxa" w:w="4320"/>
-          </w:tcPr>
-          <w:p>
-            <w:r>
-              <w:t>38.600</w:t>
-            </w:r>
-          </w:p>
-        </w:tc>
-      </w:tr>
-      <w:tr>
-        <w:tc>
-          <w:tcPr>
-            <w:tcW w:type="dxa" w:w="4320"/>
-          </w:tcPr>
-          <w:p>
-            <w:r>
-              <w:t>Abril</w:t>
-            </w:r>
-          </w:p>
-        </w:tc>
-        <w:tc>
-          <w:tcPr>
-            <w:tcW w:type="dxa" w:w="4320"/>
-          </w:tcPr>
-          <w:p>
-            <w:r>
-              <w:t>44.750</w:t>
-            </w:r>
-          </w:p>
-        </w:tc>
-      </w:tr>
-      <w:tr>
-        <w:tc>
-          <w:tcPr>
-            <w:tcW w:type="dxa" w:w="4320"/>
-          </w:tcPr>
-          <w:p>
-            <w:r>
-              <w:t>Maio</w:t>
-            </w:r>
-          </w:p>
-        </w:tc>
-        <w:tc>
-          <w:tcPr>
-            <w:tcW w:type="dxa" w:w="4320"/>
-          </w:tcPr>
-          <w:p>
-            <w:r>
-              <w:t>47.600</w:t>
-            </w:r>
-          </w:p>
-        </w:tc>
-      </w:tr>
-      <w:tr>
-        <w:tc>
-          <w:tcPr>
-            <w:tcW w:type="dxa" w:w="4320"/>
-          </w:tcPr>
-          <w:p>
-            <w:r>
-              <w:t>Junho</w:t>
-            </w:r>
-          </w:p>
-        </w:tc>
-        <w:tc>
-          <w:tcPr>
-            <w:tcW w:type="dxa" w:w="4320"/>
-          </w:tcPr>
-          <w:p>
-            <w:r>
-              <w:t>53.700</w:t>
-            </w:r>
-          </w:p>
-        </w:tc>
-      </w:tr>
-      <w:tr>
-        <w:tc>
-          <w:tcPr>
-            <w:tcW w:type="dxa" w:w="4320"/>
-          </w:tcPr>
-          <w:p>
-            <w:r>
-              <w:t>Julho</w:t>
-            </w:r>
-          </w:p>
-        </w:tc>
-        <w:tc>
-          <w:tcPr>
-            <w:tcW w:type="dxa" w:w="4320"/>
-          </w:tcPr>
-          <w:p>
-            <w:r>
-              <w:t>62.500</w:t>
-            </w:r>
-          </w:p>
-        </w:tc>
-      </w:tr>
-      <w:tr>
-        <w:tc>
-          <w:tcPr>
-            <w:tcW w:type="dxa" w:w="4320"/>
-          </w:tcPr>
-          <w:p>
-            <w:r>
-              <w:t>Agosto</w:t>
-            </w:r>
-          </w:p>
-        </w:tc>
-        <w:tc>
-          <w:tcPr>
-            <w:tcW w:type="dxa" w:w="4320"/>
-          </w:tcPr>
-          <w:p>
-            <w:r>
-              <w:t>61.150</w:t>
-            </w:r>
-          </w:p>
-        </w:tc>
-      </w:tr>
-      <w:tr>
-        <w:tc>
-          <w:tcPr>
-            <w:tcW w:type="dxa" w:w="4320"/>
-          </w:tcPr>
-          <w:p>
-            <w:r>
-              <w:t>Setembro</w:t>
-            </w:r>
-          </w:p>
-        </w:tc>
-        <w:tc>
-          <w:tcPr>
-            <w:tcW w:type="dxa" w:w="4320"/>
-          </w:tcPr>
-          <w:p>
-            <w:r>
-              <w:t>48.700</w:t>
-            </w:r>
-          </w:p>
-        </w:tc>
-      </w:tr>
-      <w:tr>
-        <w:tc>
-          <w:tcPr>
-            <w:tcW w:type="dxa" w:w="4320"/>
-          </w:tcPr>
-          <w:p>
-            <w:r>
-              <w:t>Outubro</w:t>
-            </w:r>
-          </w:p>
-        </w:tc>
-        <w:tc>
-          <w:tcPr>
-            <w:tcW w:type="dxa" w:w="4320"/>
-          </w:tcPr>
-          <w:p>
-            <w:r>
-              <w:t>52.900</w:t>
-            </w:r>
-          </w:p>
-        </w:tc>
-      </w:tr>
-      <w:tr>
-        <w:tc>
-          <w:tcPr>
-            <w:tcW w:type="dxa" w:w="4320"/>
-          </w:tcPr>
-          <w:p>
-            <w:r>
-              <w:t>Novembro</w:t>
-            </w:r>
-          </w:p>
-        </w:tc>
-        <w:tc>
-          <w:tcPr>
-            <w:tcW w:type="dxa" w:w="4320"/>
-          </w:tcPr>
-          <w:p>
-            <w:r>
-              <w:t>71.600</w:t>
-            </w:r>
-          </w:p>
-        </w:tc>
-      </w:tr>
-      <w:tr>
-        <w:tc>
-          <w:tcPr>
-            <w:tcW w:type="dxa" w:w="4320"/>
-          </w:tcPr>
-          <w:p>
-            <w:r>
-              <w:t>Dezembro</w:t>
-            </w:r>
-          </w:p>
-        </w:tc>
-        <w:tc>
-          <w:tcPr>
-            <w:tcW w:type="dxa" w:w="4320"/>
-          </w:tcPr>
-          <w:p>
-            <w:r>
-              <w:t>90.000</w:t>
-            </w:r>
-          </w:p>
-        </w:tc>
-      </w:tr>
-    </w:tbl>
+    <w:p>
+      <w:r>
+        <w:rPr>
+          <w:i/>
+        </w:rPr>
+        <w:t>o pico do fim de cada ano coincide com a campanha de Natal</w:t>
+      </w:r>
+    </w:p>
+    <w:p>
+      <w:pPr>
+        <w:pStyle w:val="Heading2"/>
+      </w:pPr>
+      <w:r>
+        <w:t>Análise</w:t>
+      </w:r>
+    </w:p>
+    <w:p>
+      <w:r>
+        <w:rPr>
+          <w:b/>
+        </w:rPr>
+        <w:t xml:space="preserve">Âmbito. </w:t>
+      </w:r>
+      <w:r>
+        <w:t>36 categorias de «Periodo», a partir de 108 linhas. Total 2.058.682; média 57.185,61; mediana 53.662,5.</w:t>
+      </w:r>
+    </w:p>
+    <w:p>
+      <w:r>
+        <w:rPr>
+          <w:b/>
+        </w:rPr>
+        <w:t xml:space="preserve">Amplitude. </w:t>
+      </w:r>
+      <w:r>
+        <w:t>Máximo 112.420 em «2025-12»; mínimo 29.160 em «2023-02». Amplitude 83.260; rácio de 3,86.</w:t>
+      </w:r>
+    </w:p>
+    <w:p>
+      <w:r>
+        <w:rPr>
+          <w:b/>
+        </w:rPr>
+        <w:t xml:space="preserve">Dispersão. </w:t>
+      </w:r>
+      <w:r>
+        <w:t>Desvio-padrão 18.675,56; coeficiente de variação 32,7% — dispersão moderada (critério: &lt;15% baixa, 15–35% moderada, &gt;35% elevada).</w:t>
+      </w:r>
+    </w:p>
+    <w:p>
+      <w:r>
+        <w:rPr>
+          <w:b/>
+        </w:rPr>
+        <w:t xml:space="preserve">Concentração. </w:t>
+      </w:r>
+      <w:r>
+        <w:t>A maior categoria representa 5,5% do total — concentração baixa (critério: &lt;25% baixa, 25–50% moderada, &gt;50% elevada). As três maiores valem 14,5%.</w:t>
+      </w:r>
+    </w:p>
+    <w:p>
+      <w:r>
+        <w:rPr>
+          <w:b/>
+        </w:rPr>
+        <w:t xml:space="preserve">Valores atípicos. </w:t>
+      </w:r>
+      <w:r>
+        <w:t>1 valor fora do intervalo interquartil alargado (método de Tukey, 1,5×IQR): «2025-12» (112.420).</w:t>
+      </w:r>
+    </w:p>
+    <w:p>
+      <w:r>
+        <w:rPr>
+          <w:b/>
+        </w:rPr>
+        <w:t xml:space="preserve">Evolução. </w:t>
+      </w:r>
+      <w:r>
+        <w:t>Do primeiro ao último período: +80.830 (+255,9%). Das 35 variações período a período, 24 positivas e 11 negativas — série não monótona. Maior subida: «2025-10» → «2025-11», +26.211. Maior descida: «2024-12» → «2025-01», -47.784.</w:t>
+      </w:r>
+    </w:p>
+    <w:p>
+      <w:r>
+        <w:rPr>
+          <w:b/>
+        </w:rPr>
+        <w:t xml:space="preserve">Tendência. </w:t>
+      </w:r>
+      <w:r>
+        <w:t>Regressão linear com declive de +1.214,15 por período e R² de 0,47 — ajuste moderado (critério: &lt;0,3 fraco, 0,3–0,7 moderado, &gt;0,7 forte). Leitura: tendência crescente.</w:t>
+      </w:r>
+    </w:p>
+    <w:p>
+      <w:r>
+        <w:rPr>
+          <w:b/>
+        </w:rPr>
+        <w:t xml:space="preserve">Crescimento médio. </w:t>
+      </w:r>
+      <w:r>
+        <w:t>Taxa de crescimento média geométrica de +3,7% por período.</w:t>
+      </w:r>
+    </w:p>
+    <w:p>
+      <w:r>
+        <w:rPr>
+          <w:b/>
+        </w:rPr>
+        <w:t xml:space="preserve">Sazonalidade. </w:t>
+      </w:r>
+      <w:r>
+        <w:t>Índice sazonal sobre 3 ciclos anuais (média de cada mês a dividir pela média geral). Mês mais forte: Dezembro, índice 1,65 — 65,4% acima do mês típico. Mês mais fraco: Fevereiro, índice 0,62 — 38,3% abaixo.</w:t>
+      </w:r>
+    </w:p>
+    <w:p>
+      <w:r>
+        <w:rPr>
+          <w:b/>
+        </w:rPr>
+        <w:t xml:space="preserve">Ano a ano. </w:t>
+      </w:r>
+      <w:r>
+        <w:t>Totais por ano — 2023: 567.000; 2024: 676.199; 2025: 815.483.</w:t>
+      </w:r>
+    </w:p>
+    <w:p>
+      <w:r>
+        <w:rPr>
+          <w:b/>
+        </w:rPr>
+        <w:t xml:space="preserve">Comparação entre anos. </w:t>
+      </w:r>
+      <w:r>
+        <w:t>Variação interanual — 2023→2024: +109.199 (+19,3%); 2024→2025: +139.284 (+20,6%). 2 de 2 variações foram positivas. Do primeiro ao último ano: +248.483 (+43,8%). Ano mais alto: 2025 (815.483); mais baixo: 2023 (567.000).</w:t>
+      </w:r>
+    </w:p>
     <w:p>
       <w:r>
         <w:br w:type="page"/>
@@ -369,7 +209,7 @@
         <w:pStyle w:val="Heading1"/>
       </w:pPr>
       <w:r>
-        <w:t>Encomendas por mês</w:t>
+        <w:t>Valor vendido por canal</w:t>
       </w:r>
     </w:p>
     <w:p>
@@ -413,72 +253,103 @@
     </w:p>
     <w:p>
       <w:r>
-        <w:t>O gráfico mostra o total de «Encomendas» por «Mes», a partir de 36 linhas agrupadas em 12 categorias. O total é 15.080. O valor mais alto é 2.109, em «Dezembro», e o mais baixo é 768, em «Fevereiro».</w:t>
+        <w:t>O gráfico mostra o total de «Valor» por «Canal», a partir de 108 linhas agrupadas em 3 categorias. O total é 2.058.682. O valor mais alto é 1.142.185, em «Loja online», e o mais baixo é 296.476, em «Loja fisica».</w:t>
+      </w:r>
+    </w:p>
+    <w:p>
+      <w:pPr>
+        <w:pStyle w:val="Heading2"/>
+      </w:pPr>
+      <w:r>
+        <w:t>Análise</w:t>
       </w:r>
     </w:p>
     <w:p>
       <w:r>
         <w:rPr>
-          <w:i/>
+          <w:b/>
         </w:rPr>
-        <w:t>o pico do fim do ano coincide com a campanha de Natal</w:t>
+        <w:t xml:space="preserve">Âmbito. </w:t>
+      </w:r>
+      <w:r>
+        <w:t>3 categorias de «Canal», a partir de 108 linhas. Total 2.058.682; média 686.227,33; mediana 620.021.</w:t>
       </w:r>
     </w:p>
     <w:p>
       <w:r>
-        <w:br w:type="page"/>
+        <w:rPr>
+          <w:b/>
+        </w:rPr>
+        <w:t xml:space="preserve">Amplitude. </w:t>
       </w:r>
-    </w:p>
-    <w:p>
-      <w:pPr>
-        <w:pStyle w:val="Heading1"/>
-      </w:pPr>
       <w:r>
-        <w:t>Peso de cada canal no valor total</w:t>
-      </w:r>
-    </w:p>
-    <w:p>
-      <w:pPr>
-        <w:jc w:val="center"/>
-      </w:pPr>
-      <w:r>
-        <w:drawing>
-          <wp:inline xmlns:a="http://schemas.openxmlformats.org/drawingml/2006/main" xmlns:pic="http://schemas.openxmlformats.org/drawingml/2006/picture">
-            <wp:extent cx="5486400" cy="3090592"/>
-            <wp:docPr id="3" name="Picture 3"/>
-            <wp:cNvGraphicFramePr>
-              <a:graphicFrameLocks noChangeAspect="1"/>
-            </wp:cNvGraphicFramePr>
-            <a:graphic>
-              <a:graphicData uri="http://schemas.openxmlformats.org/drawingml/2006/picture">
-                <pic:pic>
-                  <pic:nvPicPr>
-                    <pic:cNvPr id="0" name="grafico_3.png"/>
-                    <pic:cNvPicPr/>
-                  </pic:nvPicPr>
-                  <pic:blipFill>
-                    <a:blip r:embed="rId11"/>
-                    <a:stretch>
-                      <a:fillRect/>
-                    </a:stretch>
-                  </pic:blipFill>
-                  <pic:spPr>
-                    <a:xfrm>
-                      <a:off x="0" y="0"/>
-                      <a:ext cx="5486400" cy="3090592"/>
-                    </a:xfrm>
-                    <a:prstGeom prst="rect"/>
-                  </pic:spPr>
-                </pic:pic>
-              </a:graphicData>
-            </a:graphic>
-          </wp:inline>
-        </w:drawing>
+        <w:t>Máximo 1.142.185 em «Loja online»; mínimo 296.476 em «Loja fisica». Amplitude 845.709; rácio de 3,85.</w:t>
       </w:r>
     </w:p>
     <w:p>
       <w:r>
-        <w:t>O gráfico mostra o total de «Valor» por «Canal», a partir de 36 linhas agrupadas em 3 categorias. O total é 637.020. O valor mais alto é 358.070, em «Loja online», e o mais baixo é 113.350, em «Loja fisica». A maior fatia, «Loja online», representa 56,20% do total.</w:t>
+        <w:rPr>
+          <w:b/>
+        </w:rPr>
+        <w:t xml:space="preserve">Dispersão. </w:t>
+      </w:r>
+      <w:r>
+        <w:t>Desvio-padrão 426.724,02; coeficiente de variação 62,2% — dispersão elevada (critério: &lt;15% baixa, 15–35% moderada, &gt;35% elevada).</w:t>
+      </w:r>
+    </w:p>
+    <w:p>
+      <w:r>
+        <w:rPr>
+          <w:b/>
+        </w:rPr>
+        <w:t xml:space="preserve">Concentração. </w:t>
+      </w:r>
+      <w:r>
+        <w:t>A maior categoria representa 55,5% do total — concentração elevada (critério: &lt;25% baixa, 25–50% moderada, &gt;50% elevada).</w:t>
+      </w:r>
+    </w:p>
+    <w:p>
+      <w:r>
+        <w:rPr>
+          <w:b/>
+        </w:rPr>
+        <w:t xml:space="preserve">Valores atípicos. </w:t>
+      </w:r>
+      <w:r>
+        <w:t>Não avaliados — o método de Tukey (1,5×IQR) precisa de pelo menos 5 categorias e há 3.</w:t>
+      </w:r>
+    </w:p>
+    <w:p>
+      <w:r>
+        <w:rPr>
+          <w:b/>
+        </w:rPr>
+        <w:t xml:space="preserve">Evolução. </w:t>
+      </w:r>
+      <w:r>
+        <w:t>Não analisada — «Canal» é um eixo categórico, não uma linha do tempo. Tendências e regressões só têm significado quando a ordem das categorias é a ordem do tempo.</w:t>
+      </w:r>
+    </w:p>
+    <w:p>
+      <w:r>
+        <w:rPr>
+          <w:b/>
+        </w:rPr>
+        <w:t xml:space="preserve">Ano a ano. </w:t>
+      </w:r>
+      <w:r>
+        <w:t>Totais por ano — 2023: 567.000; 2024: 676.199; 2025: 815.483.</w:t>
+      </w:r>
+    </w:p>
+    <w:p>
+      <w:r>
+        <w:rPr>
+          <w:b/>
+        </w:rPr>
+        <w:t xml:space="preserve">Comparação entre anos. </w:t>
+      </w:r>
+      <w:r>
+        <w:t>Variação interanual — 2023→2024: +109.199 (+19,3%); 2024→2025: +139.284 (+20,6%). 2 de 2 variações foram positivas. Do primeiro ao último ano: +248.483 (+43,8%). Ano mais alto: 2025 (815.483); mais baixo: 2023 (567.000).</w:t>
       </w:r>
     </w:p>
     <w:tbl>
@@ -530,7 +401,7 @@
           </w:tcPr>
           <w:p>
             <w:r>
-              <w:t>358.070</w:t>
+              <w:t>1.142.185</w:t>
             </w:r>
           </w:p>
         </w:tc>
@@ -552,7 +423,7 @@
           </w:tcPr>
           <w:p>
             <w:r>
-              <w:t>165.600</w:t>
+              <w:t>620.021</w:t>
             </w:r>
           </w:p>
         </w:tc>
@@ -574,12 +445,143 @@
           </w:tcPr>
           <w:p>
             <w:r>
-              <w:t>113.350</w:t>
+              <w:t>296.476</w:t>
             </w:r>
           </w:p>
         </w:tc>
       </w:tr>
     </w:tbl>
+    <w:p>
+      <w:r>
+        <w:br w:type="page"/>
+      </w:r>
+    </w:p>
+    <w:p>
+      <w:pPr>
+        <w:pStyle w:val="Heading1"/>
+      </w:pPr>
+      <w:r>
+        <w:t>Peso de cada canal nas encomendas</w:t>
+      </w:r>
+    </w:p>
+    <w:p>
+      <w:pPr>
+        <w:jc w:val="center"/>
+      </w:pPr>
+      <w:r>
+        <w:drawing>
+          <wp:inline xmlns:a="http://schemas.openxmlformats.org/drawingml/2006/main" xmlns:pic="http://schemas.openxmlformats.org/drawingml/2006/picture">
+            <wp:extent cx="5486400" cy="3090592"/>
+            <wp:docPr id="3" name="Picture 3"/>
+            <wp:cNvGraphicFramePr>
+              <a:graphicFrameLocks noChangeAspect="1"/>
+            </wp:cNvGraphicFramePr>
+            <a:graphic>
+              <a:graphicData uri="http://schemas.openxmlformats.org/drawingml/2006/picture">
+                <pic:pic>
+                  <pic:nvPicPr>
+                    <pic:cNvPr id="0" name="grafico_3.png"/>
+                    <pic:cNvPicPr/>
+                  </pic:nvPicPr>
+                  <pic:blipFill>
+                    <a:blip r:embed="rId11"/>
+                    <a:stretch>
+                      <a:fillRect/>
+                    </a:stretch>
+                  </pic:blipFill>
+                  <pic:spPr>
+                    <a:xfrm>
+                      <a:off x="0" y="0"/>
+                      <a:ext cx="5486400" cy="3090592"/>
+                    </a:xfrm>
+                    <a:prstGeom prst="rect"/>
+                  </pic:spPr>
+                </pic:pic>
+              </a:graphicData>
+            </a:graphic>
+          </wp:inline>
+        </w:drawing>
+      </w:r>
+    </w:p>
+    <w:p>
+      <w:r>
+        <w:t>O gráfico mostra o total de «Encomendas» por «Canal», a partir de 108 linhas agrupadas em 3 categorias. O total é 49.147. O valor mais alto é 25.128, em «Loja online», e o mais baixo é 6.967, em «Loja fisica». A maior fatia, «Loja online», representa 51,1% do total.</w:t>
+      </w:r>
+    </w:p>
+    <w:p>
+      <w:pPr>
+        <w:pStyle w:val="Heading2"/>
+      </w:pPr>
+      <w:r>
+        <w:t>Análise</w:t>
+      </w:r>
+    </w:p>
+    <w:p>
+      <w:r>
+        <w:rPr>
+          <w:b/>
+        </w:rPr>
+        <w:t xml:space="preserve">Âmbito. </w:t>
+      </w:r>
+      <w:r>
+        <w:t>3 categorias de «Canal», a partir de 108 linhas. Total 49.147; média 16.382,33; mediana 17.052.</w:t>
+      </w:r>
+    </w:p>
+    <w:p>
+      <w:r>
+        <w:rPr>
+          <w:b/>
+        </w:rPr>
+        <w:t xml:space="preserve">Amplitude. </w:t>
+      </w:r>
+      <w:r>
+        <w:t>Máximo 25.128 em «Loja online»; mínimo 6.967 em «Loja fisica». Amplitude 18.161; rácio de 3,61.</w:t>
+      </w:r>
+    </w:p>
+    <w:p>
+      <w:r>
+        <w:rPr>
+          <w:b/>
+        </w:rPr>
+        <w:t xml:space="preserve">Dispersão. </w:t>
+      </w:r>
+      <w:r>
+        <w:t>Desvio-padrão 9.099,0; coeficiente de variação 55,5% — dispersão elevada (critério: &lt;15% baixa, 15–35% moderada, &gt;35% elevada).</w:t>
+      </w:r>
+    </w:p>
+    <w:p>
+      <w:r>
+        <w:rPr>
+          <w:b/>
+        </w:rPr>
+        <w:t xml:space="preserve">Concentração. </w:t>
+      </w:r>
+      <w:r>
+        <w:t>A maior categoria representa 51,1% do total — concentração elevada (critério: &lt;25% baixa, 25–50% moderada, &gt;50% elevada).</w:t>
+      </w:r>
+    </w:p>
+    <w:p>
+      <w:r>
+        <w:rPr>
+          <w:b/>
+        </w:rPr>
+        <w:t xml:space="preserve">Valores atípicos. </w:t>
+      </w:r>
+      <w:r>
+        <w:t>Não avaliados — o método de Tukey (1,5×IQR) precisa de pelo menos 5 categorias e há 3.</w:t>
+      </w:r>
+    </w:p>
+    <w:p>
+      <w:r>
+        <w:rPr>
+          <w:b/>
+        </w:rPr>
+        <w:t xml:space="preserve">Evolução. </w:t>
+      </w:r>
+      <w:r>
+        <w:t>Não analisada — «Canal» é um eixo categórico, não uma linha do tempo. Tendências e regressões só têm significado quando a ordem das categorias é a ordem do tempo.</w:t>
+      </w:r>
+    </w:p>
     <w:p>
       <w:r>
         <w:br w:type="page"/>
@@ -608,7 +610,7 @@
         <w:pStyle w:val="ListBullet"/>
       </w:pPr>
       <w:r>
-        <w:t>Valor vendido por mês: 36 linhas agrupadas em 12 categorias de «Mes» (soma).</w:t>
+        <w:t>Valor vendido por mês: «Periodo» tratado como linha do tempo.</w:t>
       </w:r>
     </w:p>
     <w:p>
@@ -616,7 +618,7 @@
         <w:pStyle w:val="ListBullet"/>
       </w:pPr>
       <w:r>
-        <w:t>Encomendas por mês: 36 linhas agrupadas em 12 categorias de «Mes» (soma).</w:t>
+        <w:t>Valor vendido por mês: 108 linhas agrupadas em 36 categorias de «Periodo» (soma).</w:t>
       </w:r>
     </w:p>
     <w:p>
@@ -624,7 +626,15 @@
         <w:pStyle w:val="ListBullet"/>
       </w:pPr>
       <w:r>
-        <w:t>Peso de cada canal no valor total: 36 linhas agrupadas em 3 categorias de «Canal» (soma).</w:t>
+        <w:t>Valor vendido por canal: 108 linhas agrupadas em 3 categorias de «Canal» (soma).</w:t>
+      </w:r>
+    </w:p>
+    <w:p>
+      <w:pPr>
+        <w:pStyle w:val="ListBullet"/>
+      </w:pPr>
+      <w:r>
+        <w:t>Peso de cada canal nas encomendas: 108 linhas agrupadas em 3 categorias de «Canal» (soma).</w:t>
       </w:r>
     </w:p>
     <w:sectPr>

</xml_diff>

<commit_message>
Previsoes a pedido, com intervalo e guardas
O utilizador passa a poder pedir previsao dos periodos seguintes com o
campo previsao. Metodo: dessazonalizar, ajustar a reta, extrapolar,
reaplicar a sazonalidade -- no exemplo, o R2 sobe de 0,47 na serie bruta
para 0,89 na dessazonalizada.

Nunca um numero solto: cada periodo sai como intervalo a 95%. Recusa e
explica-se quando faltam periodos (minimo 8), quando o ajuste e fraco
(R2 minimo 0,3), quando o horizonte pedido e excessivo (um terco da
serie, no maximo 12) ou quando o eixo e categorico.

A previsao nao entra no grafico: num grafico, um tracejado confunde-se
com facto numa captura de ecra.

Causas e recomendacoes continuam de fora, agora com a razao escrita no
README -- o ficheiro tem numeros, nao tem o mundo.

Tambem corrigido: inteiros do numpy nao passavam no isinstance do
Python, e os rotulos de anos futuros saiam errados.

Co-Authored-By: Claude Opus 5 (1M context) <noreply@anthropic.com>
</commit_message>
<xml_diff>
--- a/exemplos/relatorio_exemplo.docx
+++ b/exemplos/relatorio_exemplo.docx
@@ -175,6 +175,17 @@
       </w:r>
       <w:r>
         <w:t>Índice sazonal sobre 3 ciclos anuais (média de cada mês a dividir pela média geral). Mês mais forte: Dezembro, índice 1,65 — 65,4% acima do mês típico. Mês mais fraco: Fevereiro, índice 0,62 — 38,3% abaixo.</w:t>
+      </w:r>
+    </w:p>
+    <w:p>
+      <w:r>
+        <w:rPr>
+          <w:b/>
+        </w:rPr>
+        <w:t xml:space="preserve">Previsão. </w:t>
+      </w:r>
+      <w:r>
+        <w:t>Método: tendência linear sobre a série dessazonalizada, com o fator sazonal reaplicado a cada período previsto, ajustada a 36 períodos (R² de 0,89). Intervalos a 95% — 2026-01 entre 43.637 e 51.815; 2026-02 entre 40.737 e 48.319; 2026-03 entre 50.348 e 59.657; 2026-04 entre 57.846 e 68.475; 2026-05 entre 61.987 e 73.308; 2026-06 entre 69.748 e 82.416. Pressupõe que a tendência e a sazonalidade observadas se mantêm. Não incorpora nada que não esteja no ficheiro.</w:t>
       </w:r>
     </w:p>
     <w:p>

</xml_diff>

<commit_message>
Avaliacao face a uma meta dada pelo utilizador
A ultima linha do «nao faz» que era mesmo uma limitacao de desenho:
faltava a referencia. Com o campo meta, avaliar desempenho deixa de ser
opiniao e passa a aritmetica.

Campo meta com valor e ambito. O ambito e explicito de proposito, porque
«meta de 700.000» pode querer dizer o total do periodo ou o que cada
categoria deve atingir, e inferir qual seria adivinhar.

  total     -- o total (ou a media, se a agregacao for media) contra a meta
  categoria -- quantas atingiram, quais ficaram mais longe, e o defice somado

Mesmo com meta, o relatorio diz quanto foi contra quanto se queria e a
diferenca; nunca diz se o resultado e bom. Ha um teste que varre o texto
a procura de bom, mau, fraco, excelente, preocupante e falhou.

Causas e recomendacoes continuam de fora para sempre.

Co-Authored-By: Claude Opus 5 (1M context) <noreply@anthropic.com>
</commit_message>
<xml_diff>
--- a/exemplos/relatorio_exemplo.docx
+++ b/exemplos/relatorio_exemplo.docx
@@ -87,6 +87,17 @@
       </w:r>
       <w:r>
         <w:t>36 categorias de «Periodo», a partir de 108 linhas. Total 2.058.682; média 57.185,61; mediana 53.662,5.</w:t>
+      </w:r>
+    </w:p>
+    <w:p>
+      <w:r>
+        <w:rPr>
+          <w:b/>
+        </w:rPr>
+        <w:t xml:space="preserve">Meta. </w:t>
+      </w:r>
+      <w:r>
+        <w:t>Meta definida: 2.000.000. O total é 2.058.682 — 102,9% da meta, 58.682 acima da meta.</w:t>
       </w:r>
     </w:p>
     <w:p>
@@ -284,6 +295,17 @@
       </w:r>
       <w:r>
         <w:t>3 categorias de «Canal», a partir de 108 linhas. Total 2.058.682; média 686.227,33; mediana 620.021.</w:t>
+      </w:r>
+    </w:p>
+    <w:p>
+      <w:r>
+        <w:rPr>
+          <w:b/>
+        </w:rPr>
+        <w:t xml:space="preserve">Meta. </w:t>
+      </w:r>
+      <w:r>
+        <w:t>Meta definida: 600.000 por categoria. 2 de 3 categorias atingiram-na (66,7%). Mais distantes da meta: «Loja fisica» com 296.476 (303.524 abaixo). Somando o que faltou a cada uma, o défice total é 303.524. A média por categoria é 686.227, 114,4% da meta.</w:t>
       </w:r>
     </w:p>
     <w:p>

</xml_diff>

<commit_message>
Pagina de rosto, indice e numeracao de paginas
O documento comecava logo num grafico, sem rosto e sem numeros de pagina:
parecia o resultado de um script, nao um relatorio. Quem abre o ficheiro
nota, e o objetivo declarado e mostra-lo a recrutadores.

Capa com titulo, data e ficheiro de origem. Indice dos graficos. Numero de
pagina no rodape, com a capa nao numerada.

Duas decisoes que valem a pena:

O indice e uma lista simples e nao um campo de indice do Word. O campo
aparece vazio ate alguem carregar em atualizar, e um indice em branco e
pior do que nenhum.

A captura do README passa a mostrar a primeira pagina COM grafico, e nao a
pagina 1. Com a capa nova, a pagina 1 e quase toda branca -- deixar a
captura na pagina 1 teria piorado o README em vez de melhorar.

Co-Authored-By: Claude Opus 5 (1M context) <noreply@anthropic.com>
</commit_message>
<xml_diff>
--- a/exemplos/relatorio_exemplo.docx
+++ b/exemplos/relatorio_exemplo.docx
@@ -2,12 +2,76 @@
 <file path=word/document.xml><?xml version="1.0" encoding="utf-8"?>
 <w:document xmlns:wpc="http://schemas.microsoft.com/office/word/2010/wordprocessingCanvas" xmlns:mo="http://schemas.microsoft.com/office/mac/office/2008/main" xmlns:mc="http://schemas.openxmlformats.org/markup-compatibility/2006" xmlns:mv="urn:schemas-microsoft-com:mac:vml" xmlns:o="urn:schemas-microsoft-com:office:office" xmlns:r="http://schemas.openxmlformats.org/officeDocument/2006/relationships" xmlns:m="http://schemas.openxmlformats.org/officeDocument/2006/math" xmlns:v="urn:schemas-microsoft-com:vml" xmlns:wp14="http://schemas.microsoft.com/office/word/2010/wordprocessingDrawing" xmlns:wp="http://schemas.openxmlformats.org/drawingml/2006/wordprocessingDrawing" xmlns:w10="urn:schemas-microsoft-com:office:word" xmlns:w="http://schemas.openxmlformats.org/wordprocessingml/2006/main" xmlns:w14="http://schemas.microsoft.com/office/word/2010/wordml" xmlns:wpg="http://schemas.microsoft.com/office/word/2010/wordprocessingGroup" xmlns:wpi="http://schemas.microsoft.com/office/word/2010/wordprocessingInk" xmlns:wne="http://schemas.microsoft.com/office/word/2006/wordml" xmlns:wps="http://schemas.microsoft.com/office/word/2010/wordprocessingShape" mc:Ignorable="w14 wp14">
   <w:body>
+    <w:p/>
+    <w:p/>
+    <w:p/>
+    <w:p/>
     <w:p>
       <w:pPr>
-        <w:pStyle w:val="Title"/>
+        <w:jc w:val="center"/>
       </w:pPr>
       <w:r>
+        <w:rPr>
+          <w:b/>
+          <w:sz w:val="56"/>
+        </w:rPr>
         <w:t>Vendas 2023–2025</w:t>
+      </w:r>
+    </w:p>
+    <w:p>
+      <w:pPr>
+        <w:jc w:val="center"/>
+      </w:pPr>
+      <w:r>
+        <w:rPr>
+          <w:sz w:val="22"/>
+        </w:rPr>
+        <w:t>Relatório gerado em 16/08/2026</w:t>
+      </w:r>
+    </w:p>
+    <w:p>
+      <w:pPr>
+        <w:jc w:val="center"/>
+      </w:pPr>
+      <w:r>
+        <w:rPr>
+          <w:i/>
+          <w:sz w:val="20"/>
+        </w:rPr>
+        <w:t>A partir de vendas_2023_2025.xlsx</w:t>
+      </w:r>
+    </w:p>
+    <w:p>
+      <w:r>
+        <w:br w:type="page"/>
+      </w:r>
+    </w:p>
+    <w:p>
+      <w:pPr>
+        <w:pStyle w:val="Heading1"/>
+      </w:pPr>
+      <w:r>
+        <w:t>Índice</w:t>
+      </w:r>
+    </w:p>
+    <w:p>
+      <w:r>
+        <w:t>1.  Valor vendido por mês, por canal</w:t>
+      </w:r>
+    </w:p>
+    <w:p>
+      <w:r>
+        <w:t>2.  Valor vendido por canal</w:t>
+      </w:r>
+    </w:p>
+    <w:p>
+      <w:r>
+        <w:t>3.  Peso de cada canal nas encomendas</w:t>
+      </w:r>
+    </w:p>
+    <w:p>
+      <w:r>
+        <w:br w:type="page"/>
       </w:r>
     </w:p>
     <w:p>
@@ -38,7 +102,7 @@
                     <pic:cNvPicPr/>
                   </pic:nvPicPr>
                   <pic:blipFill>
-                    <a:blip r:embed="rId9"/>
+                    <a:blip r:embed="rId10"/>
                     <a:stretch>
                       <a:fillRect/>
                     </a:stretch>
@@ -276,7 +340,7 @@
                     <pic:cNvPicPr/>
                   </pic:nvPicPr>
                   <pic:blipFill>
-                    <a:blip r:embed="rId10"/>
+                    <a:blip r:embed="rId11"/>
                     <a:stretch>
                       <a:fillRect/>
                     </a:stretch>
@@ -539,7 +603,7 @@
                     <pic:cNvPicPr/>
                   </pic:nvPicPr>
                   <pic:blipFill>
-                    <a:blip r:embed="rId11"/>
+                    <a:blip r:embed="rId12"/>
                     <a:stretch>
                       <a:fillRect/>
                     </a:stretch>
@@ -693,13 +757,34 @@
       </w:r>
     </w:p>
     <w:sectPr>
+      <w:footerReference w:type="default" r:id="rId9"/>
       <w:pgSz w:w="12240" w:h="15840"/>
       <w:pgMar w:top="1440" w:right="1800" w:bottom="1440" w:left="1800" w:header="720" w:footer="720" w:gutter="0"/>
       <w:cols w:space="720"/>
+      <w:titlePg/>
       <w:docGrid w:linePitch="360"/>
     </w:sectPr>
   </w:body>
 </w:document>
+</file>
+
+<file path=word/footer1.xml><?xml version="1.0" encoding="utf-8"?>
+<w:ftr xmlns:m="http://schemas.openxmlformats.org/officeDocument/2006/math" xmlns:mc="http://schemas.openxmlformats.org/markup-compatibility/2006" xmlns:mo="http://schemas.microsoft.com/office/mac/office/2008/main" xmlns:mv="urn:schemas-microsoft-com:mac:vml" xmlns:o="urn:schemas-microsoft-com:office:office" xmlns:r="http://schemas.openxmlformats.org/officeDocument/2006/relationships" xmlns:v="urn:schemas-microsoft-com:vml" xmlns:w10="urn:schemas-microsoft-com:office:word" xmlns:w14="http://schemas.microsoft.com/office/word/2010/wordml" xmlns:w="http://schemas.openxmlformats.org/wordprocessingml/2006/main" xmlns:wne="http://schemas.microsoft.com/office/word/2006/wordml" xmlns:wp14="http://schemas.microsoft.com/office/word/2010/wordprocessingDrawing" xmlns:wp="http://schemas.openxmlformats.org/drawingml/2006/wordprocessingDrawing" xmlns:wpc="http://schemas.microsoft.com/office/word/2010/wordprocessingCanvas" xmlns:wpg="http://schemas.microsoft.com/office/word/2010/wordprocessingGroup" xmlns:wpi="http://schemas.microsoft.com/office/word/2010/wordprocessingInk" xmlns:wps="http://schemas.microsoft.com/office/word/2010/wordprocessingShape" mc:Ignorable="w14 wp14">
+  <w:p>
+    <w:pPr>
+      <w:pStyle w:val="Footer"/>
+      <w:jc w:val="center"/>
+    </w:pPr>
+    <w:r>
+      <w:rPr>
+        <w:sz w:val="18"/>
+      </w:rPr>
+      <w:fldChar w:fldCharType="begin"/>
+      <w:instrText xml:space="preserve">PAGE</w:instrText>
+      <w:fldChar w:fldCharType="end"/>
+    </w:r>
+  </w:p>
+</w:ftr>
 </file>
 
 <file path=word/numbering.xml><?xml version="1.0" encoding="utf-8"?>

</xml_diff>